<commit_message>
Se actualiza documentacion word, se carga al one drive, se realiza CU-17, CU-18 Terminados se pasan a Done
</commit_message>
<xml_diff>
--- a/docs/BoutiqueSystem_Documentacion.docx
+++ b/docs/BoutiqueSystem_Documentacion.docx
@@ -794,7 +794,13 @@
         <w:spacing w:before="60" w:after="60"/>
       </w:pPr>
       <w:r>
-        <w:t>Control de zona horaria Colombi (UTC-5).</w:t>
+        <w:t>Control de zona horaria Colombi</w:t>
+      </w:r>
+      <w:r>
+        <w:t>a</w:t>
+      </w:r>
+      <w:r>
+        <w:t xml:space="preserve"> (UTC-5).</w:t>
       </w:r>
     </w:p>
     <w:p>
@@ -1272,7 +1278,13 @@
         <w:t>sesión</w:t>
       </w:r>
       <w:r>
-        <w:t xml:space="preserve"> con email y </w:t>
+        <w:t xml:space="preserve"> con </w:t>
+      </w:r>
+      <w:r>
+        <w:t>documento</w:t>
+      </w:r>
+      <w:r>
+        <w:t xml:space="preserve"> y </w:t>
       </w:r>
       <w:r>
         <w:t>contraseña</w:t>
@@ -1317,7 +1329,21 @@
         <w:spacing w:before="60" w:after="60"/>
       </w:pPr>
       <w:r>
-        <w:t>RF-01.4: El token debe contener el rol del usuario para el control de acceso.</w:t>
+        <w:t xml:space="preserve">RF-01.4: El token debe contener el rol del usuario para el </w:t>
+      </w:r>
+      <w:proofErr w:type="spellStart"/>
+      <w:r>
+        <w:t>cont</w:t>
+      </w:r>
+      <w:r>
+        <w:t>Colo</w:t>
+      </w:r>
+      <w:r>
+        <w:t>rol</w:t>
+      </w:r>
+      <w:proofErr w:type="spellEnd"/>
+      <w:r>
+        <w:t xml:space="preserve"> de acceso.</w:t>
       </w:r>
     </w:p>
     <w:p>
@@ -1591,9 +1617,17 @@
       <w:r>
         <w:t xml:space="preserve">RF-05.1: El Admin puede crear, listar y desactivar </w:t>
       </w:r>
-      <w:r>
-        <w:t>categorías</w:t>
-      </w:r>
+      <w:proofErr w:type="spellStart"/>
+      <w:r>
+        <w:t>ca</w:t>
+      </w:r>
+      <w:r>
+        <w:t>Col</w:t>
+      </w:r>
+      <w:r>
+        <w:t>tegorías</w:t>
+      </w:r>
+      <w:proofErr w:type="spellEnd"/>
       <w:r>
         <w:t xml:space="preserve"> de productos.</w:t>
       </w:r>
@@ -9062,10 +9096,19 @@
         <w:t xml:space="preserve">Editar Información de </w:t>
       </w:r>
       <w:r>
-        <w:t xml:space="preserve">Proveedor </w:t>
-      </w:r>
-      <w:r>
+        <w:t>Proveedor</w:t>
+      </w:r>
+      <w:r>
+        <w:t xml:space="preserve"> </w:t>
+      </w:r>
+      <w:r>
+        <w:rPr>
+          <w:highlight w:val="green"/>
+        </w:rPr>
         <w:t>Terminado</w:t>
+      </w:r>
+      <w:r>
+        <w:t xml:space="preserve"> </w:t>
       </w:r>
     </w:p>
     <w:p>
@@ -9522,7 +9565,7 @@
         <w:t>CU-</w:t>
       </w:r>
       <w:r>
-        <w:t>XX</w:t>
+        <w:t>17</w:t>
       </w:r>
       <w:r>
         <w:t xml:space="preserve">: Crear </w:t>
@@ -9540,12 +9583,9 @@
       </w:r>
       <w:r>
         <w:rPr>
-          <w:color w:val="000000"/>
-          <w:sz w:val="20"/>
-          <w:szCs w:val="20"/>
-          <w:highlight w:val="red"/>
+          <w:highlight w:val="green"/>
         </w:rPr>
-        <w:t>En Proceso</w:t>
+        <w:t>Terminado</w:t>
       </w:r>
     </w:p>
     <w:tbl>
@@ -10002,7 +10042,7 @@
         <w:t>CU-</w:t>
       </w:r>
       <w:r>
-        <w:t>XX</w:t>
+        <w:t>18</w:t>
       </w:r>
       <w:r>
         <w:t xml:space="preserve">: Listar </w:t>
@@ -10015,12 +10055,9 @@
       </w:r>
       <w:r>
         <w:rPr>
-          <w:color w:val="000000"/>
-          <w:sz w:val="20"/>
-          <w:szCs w:val="20"/>
-          <w:highlight w:val="yellow"/>
+          <w:highlight w:val="green"/>
         </w:rPr>
-        <w:t>Pendiente</w:t>
+        <w:t>Terminado</w:t>
       </w:r>
     </w:p>
     <w:tbl>
@@ -10506,9 +10543,9 @@
           <w:color w:val="000000"/>
           <w:sz w:val="20"/>
           <w:szCs w:val="20"/>
-          <w:highlight w:val="yellow"/>
+          <w:highlight w:val="red"/>
         </w:rPr>
-        <w:t>Pendiente</w:t>
+        <w:t>En Proceso</w:t>
       </w:r>
     </w:p>
     <w:tbl>
@@ -11396,6 +11433,7 @@
     </w:tbl>
     <w:p/>
     <w:p/>
+    <w:p/>
     <w:p>
       <w:pPr>
         <w:pStyle w:val="Ttulo2"/>
@@ -18374,7 +18412,10 @@
     </w:p>
     <w:p>
       <w:r>
-        <w:t>├──</w:t>
+        <w:t xml:space="preserve"> |</w:t>
+      </w:r>
+      <w:r>
+        <w:t>──</w:t>
       </w:r>
       <w:r>
         <w:t xml:space="preserve"> </w:t>
@@ -18552,7 +18593,7 @@
           <w:sz w:val="28"/>
           <w:szCs w:val="28"/>
         </w:rPr>
-        <w:t>11.3 Esctructura interna por feature</w:t>
+        <w:t>11.3 Estructura interna por feature</w:t>
       </w:r>
     </w:p>
     <w:p>
@@ -18794,6 +18835,105 @@
         </w:rPr>
         <w:t>- routers/ → expone los endpoints, valida token, delega al service</w:t>
       </w:r>
+    </w:p>
+    <w:p>
+      <w:pPr>
+        <w:rPr>
+          <w:sz w:val="24"/>
+          <w:szCs w:val="24"/>
+        </w:rPr>
+      </w:pPr>
+      <w:r>
+        <w:rPr>
+          <w:b/>
+          <w:bCs/>
+          <w:sz w:val="24"/>
+          <w:szCs w:val="24"/>
+        </w:rPr>
+        <w:br w:type="page"/>
+      </w:r>
+    </w:p>
+    <w:p>
+      <w:pPr>
+        <w:pStyle w:val="Ttulo1"/>
+        <w:rPr>
+          <w:sz w:val="28"/>
+          <w:szCs w:val="28"/>
+        </w:rPr>
+      </w:pPr>
+      <w:r>
+        <w:rPr>
+          <w:sz w:val="28"/>
+          <w:szCs w:val="28"/>
+        </w:rPr>
+        <w:lastRenderedPageBreak/>
+        <w:t>11.</w:t>
+      </w:r>
+      <w:r>
+        <w:rPr>
+          <w:sz w:val="28"/>
+          <w:szCs w:val="28"/>
+        </w:rPr>
+        <w:t>4</w:t>
+      </w:r>
+      <w:r>
+        <w:rPr>
+          <w:sz w:val="28"/>
+          <w:szCs w:val="28"/>
+        </w:rPr>
+        <w:t xml:space="preserve"> </w:t>
+      </w:r>
+      <w:r>
+        <w:rPr>
+          <w:sz w:val="28"/>
+          <w:szCs w:val="28"/>
+        </w:rPr>
+        <w:t>Versionado de la API</w:t>
+      </w:r>
+    </w:p>
+    <w:p>
+      <w:pPr>
+        <w:pStyle w:val="Ttulo1"/>
+        <w:rPr>
+          <w:b w:val="0"/>
+          <w:bCs w:val="0"/>
+          <w:color w:val="auto"/>
+          <w:sz w:val="22"/>
+          <w:szCs w:val="22"/>
+        </w:rPr>
+      </w:pPr>
+      <w:r>
+        <w:rPr>
+          <w:b w:val="0"/>
+          <w:bCs w:val="0"/>
+          <w:color w:val="auto"/>
+          <w:sz w:val="22"/>
+          <w:szCs w:val="22"/>
+        </w:rPr>
+        <w:t>Todos los endpoints del sistema están agrupados bajo el prefijo /v1, indicando que corresponden a la primera versión de la API. Este versionado permite introducir cambios futuros bajo /v2 sin romper la compatibilidad con clientes que consuman la versión anterior.</w:t>
+      </w:r>
+    </w:p>
+    <w:p>
+      <w:pPr>
+        <w:pStyle w:val="Ttulo1"/>
+        <w:rPr>
+          <w:sz w:val="28"/>
+          <w:szCs w:val="28"/>
+        </w:rPr>
+      </w:pPr>
+    </w:p>
+    <w:p>
+      <w:pPr>
+        <w:pStyle w:val="Ttulo1"/>
+        <w:spacing w:before="0" w:after="0"/>
+        <w:rPr>
+          <w:b w:val="0"/>
+          <w:bCs w:val="0"/>
+          <w:color w:val="auto"/>
+          <w:sz w:val="24"/>
+          <w:szCs w:val="24"/>
+        </w:rPr>
+      </w:pPr>
     </w:p>
     <w:p>
       <w:pPr>
@@ -18875,7 +19015,7 @@
                     <pic:cNvPicPr/>
                   </pic:nvPicPr>
                   <pic:blipFill rotWithShape="1">
-                    <a:blip r:embed="rId7" cstate="print">
+                    <a:blip r:embed="rId8" cstate="print">
                       <a:extLst>
                         <a:ext uri="{28A0092B-C50C-407E-A947-70E740481C1C}">
                           <a14:useLocalDpi xmlns:a14="http://schemas.microsoft.com/office/drawing/2010/main" val="0"/>
@@ -19326,6 +19466,657 @@
           </w:p>
         </w:tc>
       </w:tr>
+      <w:tr>
+        <w:tc>
+          <w:tcPr>
+            <w:tcW w:w="3000" w:type="dxa"/>
+            <w:tcBorders>
+              <w:top w:val="single" w:sz="1" w:space="0" w:color="CCCCCC"/>
+              <w:left w:val="single" w:sz="1" w:space="0" w:color="CCCCCC"/>
+              <w:bottom w:val="single" w:sz="1" w:space="0" w:color="CCCCCC"/>
+              <w:right w:val="single" w:sz="1" w:space="0" w:color="CCCCCC"/>
+            </w:tcBorders>
+            <w:shd w:val="clear" w:color="auto" w:fill="FFFFFF"/>
+            <w:tcMar>
+              <w:top w:w="80" w:type="dxa"/>
+              <w:left w:w="120" w:type="dxa"/>
+              <w:bottom w:w="80" w:type="dxa"/>
+              <w:right w:w="120" w:type="dxa"/>
+            </w:tcMar>
+          </w:tcPr>
+          <w:p>
+            <w:pPr>
+              <w:rPr>
+                <w:color w:val="000000"/>
+                <w:sz w:val="20"/>
+                <w:szCs w:val="20"/>
+              </w:rPr>
+            </w:pPr>
+            <w:r>
+              <w:rPr>
+                <w:color w:val="000000"/>
+                <w:sz w:val="20"/>
+                <w:szCs w:val="20"/>
+              </w:rPr>
+              <w:t>ORM</w:t>
+            </w:r>
+          </w:p>
+        </w:tc>
+        <w:tc>
+          <w:tcPr>
+            <w:tcW w:w="3000" w:type="dxa"/>
+            <w:tcBorders>
+              <w:top w:val="single" w:sz="1" w:space="0" w:color="CCCCCC"/>
+              <w:left w:val="single" w:sz="1" w:space="0" w:color="CCCCCC"/>
+              <w:bottom w:val="single" w:sz="1" w:space="0" w:color="CCCCCC"/>
+              <w:right w:val="single" w:sz="1" w:space="0" w:color="CCCCCC"/>
+            </w:tcBorders>
+            <w:shd w:val="clear" w:color="auto" w:fill="FFFFFF"/>
+            <w:tcMar>
+              <w:top w:w="80" w:type="dxa"/>
+              <w:left w:w="120" w:type="dxa"/>
+              <w:bottom w:w="80" w:type="dxa"/>
+              <w:right w:w="120" w:type="dxa"/>
+            </w:tcMar>
+          </w:tcPr>
+          <w:p>
+            <w:pPr>
+              <w:rPr>
+                <w:color w:val="000000"/>
+                <w:sz w:val="20"/>
+                <w:szCs w:val="20"/>
+              </w:rPr>
+            </w:pPr>
+            <w:r>
+              <w:rPr>
+                <w:color w:val="000000"/>
+                <w:sz w:val="20"/>
+                <w:szCs w:val="20"/>
+              </w:rPr>
+              <w:t>SQLAlchemy</w:t>
+            </w:r>
+          </w:p>
+        </w:tc>
+        <w:tc>
+          <w:tcPr>
+            <w:tcW w:w="3360" w:type="dxa"/>
+            <w:tcBorders>
+              <w:top w:val="single" w:sz="1" w:space="0" w:color="CCCCCC"/>
+              <w:left w:val="single" w:sz="1" w:space="0" w:color="CCCCCC"/>
+              <w:bottom w:val="single" w:sz="1" w:space="0" w:color="CCCCCC"/>
+              <w:right w:val="single" w:sz="1" w:space="0" w:color="CCCCCC"/>
+            </w:tcBorders>
+            <w:shd w:val="clear" w:color="auto" w:fill="FFFFFF"/>
+            <w:tcMar>
+              <w:top w:w="80" w:type="dxa"/>
+              <w:left w:w="120" w:type="dxa"/>
+              <w:bottom w:w="80" w:type="dxa"/>
+              <w:right w:w="120" w:type="dxa"/>
+            </w:tcMar>
+          </w:tcPr>
+          <w:p>
+            <w:pPr>
+              <w:rPr>
+                <w:color w:val="000000"/>
+                <w:sz w:val="20"/>
+                <w:szCs w:val="20"/>
+              </w:rPr>
+            </w:pPr>
+            <w:r>
+              <w:rPr>
+                <w:color w:val="000000"/>
+                <w:sz w:val="20"/>
+                <w:szCs w:val="20"/>
+              </w:rPr>
+              <w:t>2.0.47</w:t>
+            </w:r>
+          </w:p>
+          <w:p>
+            <w:pPr>
+              <w:rPr>
+                <w:color w:val="000000"/>
+                <w:sz w:val="20"/>
+                <w:szCs w:val="20"/>
+              </w:rPr>
+            </w:pPr>
+          </w:p>
+        </w:tc>
+      </w:tr>
+      <w:tr>
+        <w:tc>
+          <w:tcPr>
+            <w:tcW w:w="3000" w:type="dxa"/>
+            <w:tcBorders>
+              <w:top w:val="single" w:sz="1" w:space="0" w:color="CCCCCC"/>
+              <w:left w:val="single" w:sz="1" w:space="0" w:color="CCCCCC"/>
+              <w:bottom w:val="single" w:sz="1" w:space="0" w:color="CCCCCC"/>
+              <w:right w:val="single" w:sz="1" w:space="0" w:color="CCCCCC"/>
+            </w:tcBorders>
+            <w:shd w:val="clear" w:color="auto" w:fill="FFFFFF"/>
+            <w:tcMar>
+              <w:top w:w="80" w:type="dxa"/>
+              <w:left w:w="120" w:type="dxa"/>
+              <w:bottom w:w="80" w:type="dxa"/>
+              <w:right w:w="120" w:type="dxa"/>
+            </w:tcMar>
+          </w:tcPr>
+          <w:p>
+            <w:pPr>
+              <w:rPr>
+                <w:color w:val="000000"/>
+                <w:sz w:val="20"/>
+                <w:szCs w:val="20"/>
+              </w:rPr>
+            </w:pPr>
+            <w:r>
+              <w:rPr>
+                <w:color w:val="000000"/>
+                <w:sz w:val="20"/>
+                <w:szCs w:val="20"/>
+              </w:rPr>
+              <w:t>Migraciones</w:t>
+            </w:r>
+          </w:p>
+        </w:tc>
+        <w:tc>
+          <w:tcPr>
+            <w:tcW w:w="3000" w:type="dxa"/>
+            <w:tcBorders>
+              <w:top w:val="single" w:sz="1" w:space="0" w:color="CCCCCC"/>
+              <w:left w:val="single" w:sz="1" w:space="0" w:color="CCCCCC"/>
+              <w:bottom w:val="single" w:sz="1" w:space="0" w:color="CCCCCC"/>
+              <w:right w:val="single" w:sz="1" w:space="0" w:color="CCCCCC"/>
+            </w:tcBorders>
+            <w:shd w:val="clear" w:color="auto" w:fill="FFFFFF"/>
+            <w:tcMar>
+              <w:top w:w="80" w:type="dxa"/>
+              <w:left w:w="120" w:type="dxa"/>
+              <w:bottom w:w="80" w:type="dxa"/>
+              <w:right w:w="120" w:type="dxa"/>
+            </w:tcMar>
+          </w:tcPr>
+          <w:p>
+            <w:pPr>
+              <w:rPr>
+                <w:color w:val="000000"/>
+                <w:sz w:val="20"/>
+                <w:szCs w:val="20"/>
+              </w:rPr>
+            </w:pPr>
+            <w:r>
+              <w:rPr>
+                <w:color w:val="000000"/>
+                <w:sz w:val="20"/>
+                <w:szCs w:val="20"/>
+              </w:rPr>
+              <w:t>Alembic</w:t>
+            </w:r>
+          </w:p>
+        </w:tc>
+        <w:tc>
+          <w:tcPr>
+            <w:tcW w:w="3360" w:type="dxa"/>
+            <w:tcBorders>
+              <w:top w:val="single" w:sz="1" w:space="0" w:color="CCCCCC"/>
+              <w:left w:val="single" w:sz="1" w:space="0" w:color="CCCCCC"/>
+              <w:bottom w:val="single" w:sz="1" w:space="0" w:color="CCCCCC"/>
+              <w:right w:val="single" w:sz="1" w:space="0" w:color="CCCCCC"/>
+            </w:tcBorders>
+            <w:shd w:val="clear" w:color="auto" w:fill="FFFFFF"/>
+            <w:tcMar>
+              <w:top w:w="80" w:type="dxa"/>
+              <w:left w:w="120" w:type="dxa"/>
+              <w:bottom w:w="80" w:type="dxa"/>
+              <w:right w:w="120" w:type="dxa"/>
+            </w:tcMar>
+          </w:tcPr>
+          <w:p>
+            <w:pPr>
+              <w:rPr>
+                <w:color w:val="000000"/>
+                <w:sz w:val="20"/>
+                <w:szCs w:val="20"/>
+              </w:rPr>
+            </w:pPr>
+            <w:r>
+              <w:rPr>
+                <w:color w:val="000000"/>
+                <w:sz w:val="20"/>
+                <w:szCs w:val="20"/>
+              </w:rPr>
+              <w:t>1.16.5</w:t>
+            </w:r>
+          </w:p>
+        </w:tc>
+      </w:tr>
+      <w:tr>
+        <w:tc>
+          <w:tcPr>
+            <w:tcW w:w="3000" w:type="dxa"/>
+            <w:tcBorders>
+              <w:top w:val="single" w:sz="1" w:space="0" w:color="CCCCCC"/>
+              <w:left w:val="single" w:sz="1" w:space="0" w:color="CCCCCC"/>
+              <w:bottom w:val="single" w:sz="1" w:space="0" w:color="CCCCCC"/>
+              <w:right w:val="single" w:sz="1" w:space="0" w:color="CCCCCC"/>
+            </w:tcBorders>
+            <w:shd w:val="clear" w:color="auto" w:fill="FFFFFF"/>
+            <w:tcMar>
+              <w:top w:w="80" w:type="dxa"/>
+              <w:left w:w="120" w:type="dxa"/>
+              <w:bottom w:w="80" w:type="dxa"/>
+              <w:right w:w="120" w:type="dxa"/>
+            </w:tcMar>
+          </w:tcPr>
+          <w:p>
+            <w:pPr>
+              <w:rPr>
+                <w:color w:val="000000"/>
+                <w:sz w:val="20"/>
+                <w:szCs w:val="20"/>
+              </w:rPr>
+            </w:pPr>
+            <w:r>
+              <w:rPr>
+                <w:color w:val="000000"/>
+                <w:sz w:val="20"/>
+                <w:szCs w:val="20"/>
+              </w:rPr>
+              <w:t>Validación</w:t>
+            </w:r>
+          </w:p>
+        </w:tc>
+        <w:tc>
+          <w:tcPr>
+            <w:tcW w:w="3000" w:type="dxa"/>
+            <w:tcBorders>
+              <w:top w:val="single" w:sz="1" w:space="0" w:color="CCCCCC"/>
+              <w:left w:val="single" w:sz="1" w:space="0" w:color="CCCCCC"/>
+              <w:bottom w:val="single" w:sz="1" w:space="0" w:color="CCCCCC"/>
+              <w:right w:val="single" w:sz="1" w:space="0" w:color="CCCCCC"/>
+            </w:tcBorders>
+            <w:shd w:val="clear" w:color="auto" w:fill="FFFFFF"/>
+            <w:tcMar>
+              <w:top w:w="80" w:type="dxa"/>
+              <w:left w:w="120" w:type="dxa"/>
+              <w:bottom w:w="80" w:type="dxa"/>
+              <w:right w:w="120" w:type="dxa"/>
+            </w:tcMar>
+          </w:tcPr>
+          <w:p>
+            <w:pPr>
+              <w:rPr>
+                <w:color w:val="000000"/>
+                <w:sz w:val="20"/>
+                <w:szCs w:val="20"/>
+              </w:rPr>
+            </w:pPr>
+            <w:r>
+              <w:rPr>
+                <w:color w:val="000000"/>
+                <w:sz w:val="20"/>
+                <w:szCs w:val="20"/>
+              </w:rPr>
+              <w:t>Pydantic</w:t>
+            </w:r>
+          </w:p>
+        </w:tc>
+        <w:tc>
+          <w:tcPr>
+            <w:tcW w:w="3360" w:type="dxa"/>
+            <w:tcBorders>
+              <w:top w:val="single" w:sz="1" w:space="0" w:color="CCCCCC"/>
+              <w:left w:val="single" w:sz="1" w:space="0" w:color="CCCCCC"/>
+              <w:bottom w:val="single" w:sz="1" w:space="0" w:color="CCCCCC"/>
+              <w:right w:val="single" w:sz="1" w:space="0" w:color="CCCCCC"/>
+            </w:tcBorders>
+            <w:shd w:val="clear" w:color="auto" w:fill="FFFFFF"/>
+            <w:tcMar>
+              <w:top w:w="80" w:type="dxa"/>
+              <w:left w:w="120" w:type="dxa"/>
+              <w:bottom w:w="80" w:type="dxa"/>
+              <w:right w:w="120" w:type="dxa"/>
+            </w:tcMar>
+          </w:tcPr>
+          <w:p>
+            <w:pPr>
+              <w:rPr>
+                <w:color w:val="000000"/>
+                <w:sz w:val="20"/>
+                <w:szCs w:val="20"/>
+              </w:rPr>
+            </w:pPr>
+            <w:r>
+              <w:rPr>
+                <w:color w:val="000000"/>
+                <w:sz w:val="20"/>
+                <w:szCs w:val="20"/>
+              </w:rPr>
+              <w:t>2.12.5</w:t>
+            </w:r>
+          </w:p>
+        </w:tc>
+      </w:tr>
+      <w:tr>
+        <w:tc>
+          <w:tcPr>
+            <w:tcW w:w="3000" w:type="dxa"/>
+            <w:tcBorders>
+              <w:top w:val="single" w:sz="1" w:space="0" w:color="CCCCCC"/>
+              <w:left w:val="single" w:sz="1" w:space="0" w:color="CCCCCC"/>
+              <w:bottom w:val="single" w:sz="1" w:space="0" w:color="CCCCCC"/>
+              <w:right w:val="single" w:sz="1" w:space="0" w:color="CCCCCC"/>
+            </w:tcBorders>
+            <w:shd w:val="clear" w:color="auto" w:fill="FFFFFF"/>
+            <w:tcMar>
+              <w:top w:w="80" w:type="dxa"/>
+              <w:left w:w="120" w:type="dxa"/>
+              <w:bottom w:w="80" w:type="dxa"/>
+              <w:right w:w="120" w:type="dxa"/>
+            </w:tcMar>
+          </w:tcPr>
+          <w:p>
+            <w:pPr>
+              <w:rPr>
+                <w:color w:val="000000"/>
+                <w:sz w:val="20"/>
+                <w:szCs w:val="20"/>
+              </w:rPr>
+            </w:pPr>
+            <w:r>
+              <w:rPr>
+                <w:color w:val="000000"/>
+                <w:sz w:val="20"/>
+                <w:szCs w:val="20"/>
+              </w:rPr>
+              <w:t>Autenticación</w:t>
+            </w:r>
+          </w:p>
+        </w:tc>
+        <w:tc>
+          <w:tcPr>
+            <w:tcW w:w="3000" w:type="dxa"/>
+            <w:tcBorders>
+              <w:top w:val="single" w:sz="1" w:space="0" w:color="CCCCCC"/>
+              <w:left w:val="single" w:sz="1" w:space="0" w:color="CCCCCC"/>
+              <w:bottom w:val="single" w:sz="1" w:space="0" w:color="CCCCCC"/>
+              <w:right w:val="single" w:sz="1" w:space="0" w:color="CCCCCC"/>
+            </w:tcBorders>
+            <w:shd w:val="clear" w:color="auto" w:fill="FFFFFF"/>
+            <w:tcMar>
+              <w:top w:w="80" w:type="dxa"/>
+              <w:left w:w="120" w:type="dxa"/>
+              <w:bottom w:w="80" w:type="dxa"/>
+              <w:right w:w="120" w:type="dxa"/>
+            </w:tcMar>
+          </w:tcPr>
+          <w:p>
+            <w:pPr>
+              <w:rPr>
+                <w:color w:val="000000"/>
+                <w:sz w:val="20"/>
+                <w:szCs w:val="20"/>
+              </w:rPr>
+            </w:pPr>
+            <w:r>
+              <w:rPr>
+                <w:color w:val="000000"/>
+                <w:sz w:val="20"/>
+                <w:szCs w:val="20"/>
+              </w:rPr>
+              <w:t>JWT (python-jose)</w:t>
+            </w:r>
+          </w:p>
+        </w:tc>
+        <w:tc>
+          <w:tcPr>
+            <w:tcW w:w="3360" w:type="dxa"/>
+            <w:tcBorders>
+              <w:top w:val="single" w:sz="1" w:space="0" w:color="CCCCCC"/>
+              <w:left w:val="single" w:sz="1" w:space="0" w:color="CCCCCC"/>
+              <w:bottom w:val="single" w:sz="1" w:space="0" w:color="CCCCCC"/>
+              <w:right w:val="single" w:sz="1" w:space="0" w:color="CCCCCC"/>
+            </w:tcBorders>
+            <w:shd w:val="clear" w:color="auto" w:fill="FFFFFF"/>
+            <w:tcMar>
+              <w:top w:w="80" w:type="dxa"/>
+              <w:left w:w="120" w:type="dxa"/>
+              <w:bottom w:w="80" w:type="dxa"/>
+              <w:right w:w="120" w:type="dxa"/>
+            </w:tcMar>
+          </w:tcPr>
+          <w:p>
+            <w:pPr>
+              <w:rPr>
+                <w:color w:val="000000"/>
+                <w:sz w:val="20"/>
+                <w:szCs w:val="20"/>
+              </w:rPr>
+            </w:pPr>
+            <w:r>
+              <w:rPr>
+                <w:color w:val="000000"/>
+                <w:sz w:val="20"/>
+                <w:szCs w:val="20"/>
+              </w:rPr>
+              <w:t>3.3.0</w:t>
+            </w:r>
+          </w:p>
+        </w:tc>
+      </w:tr>
+      <w:tr>
+        <w:tc>
+          <w:tcPr>
+            <w:tcW w:w="3000" w:type="dxa"/>
+            <w:tcBorders>
+              <w:top w:val="single" w:sz="1" w:space="0" w:color="CCCCCC"/>
+              <w:left w:val="single" w:sz="1" w:space="0" w:color="CCCCCC"/>
+              <w:bottom w:val="single" w:sz="1" w:space="0" w:color="CCCCCC"/>
+              <w:right w:val="single" w:sz="1" w:space="0" w:color="CCCCCC"/>
+            </w:tcBorders>
+            <w:shd w:val="clear" w:color="auto" w:fill="FFFFFF"/>
+            <w:tcMar>
+              <w:top w:w="80" w:type="dxa"/>
+              <w:left w:w="120" w:type="dxa"/>
+              <w:bottom w:w="80" w:type="dxa"/>
+              <w:right w:w="120" w:type="dxa"/>
+            </w:tcMar>
+          </w:tcPr>
+          <w:p>
+            <w:pPr>
+              <w:rPr>
+                <w:color w:val="000000"/>
+                <w:sz w:val="20"/>
+                <w:szCs w:val="20"/>
+              </w:rPr>
+            </w:pPr>
+            <w:r>
+              <w:rPr>
+                <w:color w:val="000000"/>
+                <w:sz w:val="20"/>
+                <w:szCs w:val="20"/>
+              </w:rPr>
+              <w:t>Cifrado</w:t>
+            </w:r>
+          </w:p>
+        </w:tc>
+        <w:tc>
+          <w:tcPr>
+            <w:tcW w:w="3000" w:type="dxa"/>
+            <w:tcBorders>
+              <w:top w:val="single" w:sz="1" w:space="0" w:color="CCCCCC"/>
+              <w:left w:val="single" w:sz="1" w:space="0" w:color="CCCCCC"/>
+              <w:bottom w:val="single" w:sz="1" w:space="0" w:color="CCCCCC"/>
+              <w:right w:val="single" w:sz="1" w:space="0" w:color="CCCCCC"/>
+            </w:tcBorders>
+            <w:shd w:val="clear" w:color="auto" w:fill="FFFFFF"/>
+            <w:tcMar>
+              <w:top w:w="80" w:type="dxa"/>
+              <w:left w:w="120" w:type="dxa"/>
+              <w:bottom w:w="80" w:type="dxa"/>
+              <w:right w:w="120" w:type="dxa"/>
+            </w:tcMar>
+          </w:tcPr>
+          <w:p>
+            <w:pPr>
+              <w:rPr>
+                <w:color w:val="000000"/>
+                <w:sz w:val="20"/>
+                <w:szCs w:val="20"/>
+              </w:rPr>
+            </w:pPr>
+            <w:r>
+              <w:rPr>
+                <w:color w:val="000000"/>
+                <w:sz w:val="20"/>
+                <w:szCs w:val="20"/>
+              </w:rPr>
+              <w:t>bcrypt (passlib)</w:t>
+            </w:r>
+          </w:p>
+        </w:tc>
+        <w:tc>
+          <w:tcPr>
+            <w:tcW w:w="3360" w:type="dxa"/>
+            <w:tcBorders>
+              <w:top w:val="single" w:sz="1" w:space="0" w:color="CCCCCC"/>
+              <w:left w:val="single" w:sz="1" w:space="0" w:color="CCCCCC"/>
+              <w:bottom w:val="single" w:sz="1" w:space="0" w:color="CCCCCC"/>
+              <w:right w:val="single" w:sz="1" w:space="0" w:color="CCCCCC"/>
+            </w:tcBorders>
+            <w:shd w:val="clear" w:color="auto" w:fill="FFFFFF"/>
+            <w:tcMar>
+              <w:top w:w="80" w:type="dxa"/>
+              <w:left w:w="120" w:type="dxa"/>
+              <w:bottom w:w="80" w:type="dxa"/>
+              <w:right w:w="120" w:type="dxa"/>
+            </w:tcMar>
+          </w:tcPr>
+          <w:p>
+            <w:pPr>
+              <w:rPr>
+                <w:color w:val="000000"/>
+                <w:sz w:val="20"/>
+                <w:szCs w:val="20"/>
+              </w:rPr>
+            </w:pPr>
+            <w:r>
+              <w:rPr>
+                <w:color w:val="000000"/>
+                <w:sz w:val="20"/>
+                <w:szCs w:val="20"/>
+              </w:rPr>
+              <w:t>1.7.4</w:t>
+            </w:r>
+          </w:p>
+        </w:tc>
+      </w:tr>
+      <w:tr>
+        <w:tc>
+          <w:tcPr>
+            <w:tcW w:w="3000" w:type="dxa"/>
+            <w:tcBorders>
+              <w:top w:val="single" w:sz="1" w:space="0" w:color="CCCCCC"/>
+              <w:left w:val="single" w:sz="1" w:space="0" w:color="CCCCCC"/>
+              <w:bottom w:val="single" w:sz="1" w:space="0" w:color="CCCCCC"/>
+              <w:right w:val="single" w:sz="1" w:space="0" w:color="CCCCCC"/>
+            </w:tcBorders>
+            <w:shd w:val="clear" w:color="auto" w:fill="FFFFFF"/>
+            <w:tcMar>
+              <w:top w:w="80" w:type="dxa"/>
+              <w:left w:w="120" w:type="dxa"/>
+              <w:bottom w:w="80" w:type="dxa"/>
+              <w:right w:w="120" w:type="dxa"/>
+            </w:tcMar>
+          </w:tcPr>
+          <w:p>
+            <w:pPr>
+              <w:rPr>
+                <w:color w:val="000000"/>
+                <w:sz w:val="20"/>
+                <w:szCs w:val="20"/>
+              </w:rPr>
+            </w:pPr>
+            <w:r>
+              <w:rPr>
+                <w:color w:val="000000"/>
+                <w:sz w:val="20"/>
+                <w:szCs w:val="20"/>
+              </w:rPr>
+              <w:t>Servidor</w:t>
+            </w:r>
+          </w:p>
+        </w:tc>
+        <w:tc>
+          <w:tcPr>
+            <w:tcW w:w="3000" w:type="dxa"/>
+            <w:tcBorders>
+              <w:top w:val="single" w:sz="1" w:space="0" w:color="CCCCCC"/>
+              <w:left w:val="single" w:sz="1" w:space="0" w:color="CCCCCC"/>
+              <w:bottom w:val="single" w:sz="1" w:space="0" w:color="CCCCCC"/>
+              <w:right w:val="single" w:sz="1" w:space="0" w:color="CCCCCC"/>
+            </w:tcBorders>
+            <w:shd w:val="clear" w:color="auto" w:fill="FFFFFF"/>
+            <w:tcMar>
+              <w:top w:w="80" w:type="dxa"/>
+              <w:left w:w="120" w:type="dxa"/>
+              <w:bottom w:w="80" w:type="dxa"/>
+              <w:right w:w="120" w:type="dxa"/>
+            </w:tcMar>
+          </w:tcPr>
+          <w:p>
+            <w:pPr>
+              <w:rPr>
+                <w:color w:val="000000"/>
+                <w:sz w:val="20"/>
+                <w:szCs w:val="20"/>
+              </w:rPr>
+            </w:pPr>
+            <w:r>
+              <w:rPr>
+                <w:color w:val="000000"/>
+                <w:sz w:val="20"/>
+                <w:szCs w:val="20"/>
+              </w:rPr>
+              <w:t>Uvicorn</w:t>
+            </w:r>
+          </w:p>
+        </w:tc>
+        <w:tc>
+          <w:tcPr>
+            <w:tcW w:w="3360" w:type="dxa"/>
+            <w:tcBorders>
+              <w:top w:val="single" w:sz="1" w:space="0" w:color="CCCCCC"/>
+              <w:left w:val="single" w:sz="1" w:space="0" w:color="CCCCCC"/>
+              <w:bottom w:val="single" w:sz="1" w:space="0" w:color="CCCCCC"/>
+              <w:right w:val="single" w:sz="1" w:space="0" w:color="CCCCCC"/>
+            </w:tcBorders>
+            <w:shd w:val="clear" w:color="auto" w:fill="FFFFFF"/>
+            <w:tcMar>
+              <w:top w:w="80" w:type="dxa"/>
+              <w:left w:w="120" w:type="dxa"/>
+              <w:bottom w:w="80" w:type="dxa"/>
+              <w:right w:w="120" w:type="dxa"/>
+            </w:tcMar>
+          </w:tcPr>
+          <w:p>
+            <w:pPr>
+              <w:rPr>
+                <w:color w:val="000000"/>
+                <w:sz w:val="20"/>
+                <w:szCs w:val="20"/>
+              </w:rPr>
+            </w:pPr>
+            <w:r>
+              <w:rPr>
+                <w:color w:val="000000"/>
+                <w:sz w:val="20"/>
+                <w:szCs w:val="20"/>
+              </w:rPr>
+              <w:t>0.39.0</w:t>
+            </w:r>
+          </w:p>
+        </w:tc>
+      </w:tr>
     </w:tbl>
     <w:p>
       <w:pPr>
@@ -20410,8 +21201,8 @@
       </w:pPr>
     </w:p>
     <w:sectPr>
-      <w:headerReference w:type="default" r:id="rId8"/>
-      <w:footerReference w:type="default" r:id="rId9"/>
+      <w:headerReference w:type="default" r:id="rId9"/>
+      <w:footerReference w:type="default" r:id="rId10"/>
       <w:pgSz w:w="12240" w:h="15840"/>
       <w:pgMar w:top="1440" w:right="1440" w:bottom="1440" w:left="1440" w:header="708" w:footer="708" w:gutter="0"/>
       <w:cols w:space="720"/>
@@ -21196,7 +21987,6 @@
   <w:style w:type="character" w:default="1" w:styleId="Fuentedeprrafopredeter">
     <w:name w:val="Default Paragraph Font"/>
     <w:uiPriority w:val="1"/>
-    <w:semiHidden/>
     <w:unhideWhenUsed/>
   </w:style>
   <w:style w:type="table" w:default="1" w:styleId="Tablanormal">
@@ -21667,4 +22457,16 @@
     </a:ext>
   </a:extLst>
 </a:theme>
+</file>
+
+<file path=customXml/item1.xml><?xml version="1.0" encoding="utf-8"?>
+<b:Sources xmlns:b="http://schemas.openxmlformats.org/officeDocument/2006/bibliography" xmlns="http://schemas.openxmlformats.org/officeDocument/2006/bibliography" SelectedStyle="\APASixthEditionOfficeOnline.xsl" StyleName="APA" Version="6"/>
+</file>
+
+<file path=customXml/itemProps1.xml><?xml version="1.0" encoding="utf-8"?>
+<ds:datastoreItem xmlns:ds="http://schemas.openxmlformats.org/officeDocument/2006/customXml" ds:itemID="{1CDDD3DC-8EEA-418C-9C34-F9B93BBB41AA}">
+  <ds:schemaRefs>
+    <ds:schemaRef ds:uri="http://schemas.openxmlformats.org/officeDocument/2006/bibliography"/>
+  </ds:schemaRefs>
+</ds:datastoreItem>
 </file>
</xml_diff>